<commit_message>
docs(open-items): fb-595.54.76 second pass, requests settled by fb-595.54.82 and request 14; nyappterm opening's 5531 items in their number column (fb-595.54.76)
Co-Authored-By: Claude Opus 5.5 <noreply@anthropic.com>
</commit_message>
<xml_diff>
--- a/courts/second-circuit/new-york/state/appellate-terms-of-the-supreme-court/opening-brief/usage/OUTPUT-opening-brief.docx
+++ b/courts/second-circuit/new-york/state/appellate-terms-of-the-supreme-court/opening-brief/usage/OUTPUT-opening-brief.docx
@@ -870,708 +870,960 @@
         <w:t xml:space="preserve">5531</w:t>
       </w:r>
     </w:p>
-    <w:p>
-      <w:pPr>
-        <w:spacing w:before="0" w:after="0" w:line="644" w:lineRule="exact"/>
-        <w:ind w:left="0" w:firstLine="720"/>
-        <w:jc w:val="left"/>
-      </w:pPr>
-      <w:r>
-        <w:t xml:space="preserve">1.</w:t>
-      </w:r>
-      <w:r>
-        <w:t xml:space="preserve"> </w:t>
-      </w:r>
-      <w:r>
-        <w:t xml:space="preserve">The</w:t>
-      </w:r>
-      <w:r>
-        <w:t xml:space="preserve"> </w:t>
-      </w:r>
-      <w:r>
-        <w:t xml:space="preserve">index</w:t>
-      </w:r>
-      <w:r>
-        <w:t xml:space="preserve"> </w:t>
-      </w:r>
-      <w:r>
-        <w:t xml:space="preserve">number</w:t>
-      </w:r>
-      <w:r>
-        <w:t xml:space="preserve"> </w:t>
-      </w:r>
-      <w:r>
-        <w:t xml:space="preserve">of</w:t>
-      </w:r>
-      <w:r>
-        <w:t xml:space="preserve"> </w:t>
-      </w:r>
-      <w:r>
-        <w:t xml:space="preserve">the</w:t>
-      </w:r>
-      <w:r>
-        <w:t xml:space="preserve"> </w:t>
-      </w:r>
-      <w:r>
-        <w:t xml:space="preserve">case</w:t>
-      </w:r>
-      <w:r>
-        <w:t xml:space="preserve"> </w:t>
-      </w:r>
-      <w:r>
-        <w:t xml:space="preserve">is</w:t>
-      </w:r>
-      <w:r>
-        <w:t xml:space="preserve"> </w:t>
-      </w:r>
-      <w:r>
-        <w:t xml:space="preserve">083391</w:t>
-        <w:noBreakHyphen/>
-        <w:t xml:space="preserve">05.</w:t>
-      </w:r>
-    </w:p>
-    <w:p>
-      <w:pPr>
-        <w:spacing w:before="0" w:after="0" w:line="644" w:lineRule="exact"/>
-        <w:ind w:left="0" w:firstLine="720"/>
-        <w:jc w:val="left"/>
-      </w:pPr>
-      <w:r>
-        <w:t xml:space="preserve">2.</w:t>
-      </w:r>
-      <w:r>
-        <w:t xml:space="preserve"> </w:t>
-      </w:r>
-      <w:r>
-        <w:t xml:space="preserve">The</w:t>
-      </w:r>
-      <w:r>
-        <w:t xml:space="preserve"> </w:t>
-      </w:r>
-      <w:r>
-        <w:t xml:space="preserve">full</w:t>
-      </w:r>
-      <w:r>
-        <w:t xml:space="preserve"> </w:t>
-      </w:r>
-      <w:r>
-        <w:t xml:space="preserve">names</w:t>
-      </w:r>
-      <w:r>
-        <w:t xml:space="preserve"> </w:t>
-      </w:r>
-      <w:r>
-        <w:t xml:space="preserve">of</w:t>
-      </w:r>
-      <w:r>
-        <w:t xml:space="preserve"> </w:t>
-      </w:r>
-      <w:r>
-        <w:t xml:space="preserve">the</w:t>
-      </w:r>
-      <w:r>
-        <w:t xml:space="preserve"> </w:t>
-      </w:r>
-      <w:r>
-        <w:t xml:space="preserve">original</w:t>
-      </w:r>
-      <w:r>
-        <w:t xml:space="preserve"> </w:t>
-      </w:r>
-      <w:r>
-        <w:t xml:space="preserve">parties</w:t>
-      </w:r>
-      <w:r>
-        <w:t xml:space="preserve"> </w:t>
-      </w:r>
-      <w:r>
-        <w:t xml:space="preserve">are</w:t>
-      </w:r>
-      <w:r>
-        <w:t xml:space="preserve"> </w:t>
-      </w:r>
-      <w:r>
-        <w:t xml:space="preserve">as</w:t>
-      </w:r>
-      <w:r>
-        <w:t xml:space="preserve"> </w:t>
-      </w:r>
-      <w:r>
-        <w:t xml:space="preserve">stated</w:t>
-      </w:r>
-      <w:r>
-        <w:t xml:space="preserve"> </w:t>
-      </w:r>
-      <w:r>
-        <w:t xml:space="preserve">above;</w:t>
-      </w:r>
-      <w:r>
-        <w:t xml:space="preserve"> </w:t>
-      </w:r>
-      <w:r>
-        <w:t xml:space="preserve">there</w:t>
-      </w:r>
-      <w:r>
-        <w:t xml:space="preserve"> </w:t>
-      </w:r>
-      <w:r>
-        <w:t xml:space="preserve">have</w:t>
-      </w:r>
-      <w:r>
-        <w:t xml:space="preserve"> </w:t>
-      </w:r>
-      <w:r>
-        <w:t xml:space="preserve">been</w:t>
-      </w:r>
-      <w:r>
-        <w:t xml:space="preserve"> </w:t>
-      </w:r>
-      <w:r>
-        <w:t xml:space="preserve">no</w:t>
-      </w:r>
-      <w:r>
-        <w:t xml:space="preserve"> </w:t>
-      </w:r>
-      <w:r>
-        <w:t xml:space="preserve">changes.</w:t>
-      </w:r>
-    </w:p>
-    <w:p>
-      <w:pPr>
-        <w:spacing w:before="0" w:after="0" w:line="644" w:lineRule="exact"/>
-        <w:ind w:left="0" w:firstLine="720"/>
-        <w:jc w:val="left"/>
-      </w:pPr>
-      <w:r>
-        <w:t xml:space="preserve">3.</w:t>
-      </w:r>
-      <w:r>
-        <w:t xml:space="preserve"> </w:t>
-      </w:r>
-      <w:r>
-        <w:t xml:space="preserve">The</w:t>
-      </w:r>
-      <w:r>
-        <w:t xml:space="preserve"> </w:t>
-      </w:r>
-      <w:r>
-        <w:t xml:space="preserve">action</w:t>
-      </w:r>
-      <w:r>
-        <w:t xml:space="preserve"> </w:t>
-      </w:r>
-      <w:r>
-        <w:t xml:space="preserve">was</w:t>
-      </w:r>
-      <w:r>
-        <w:t xml:space="preserve"> </w:t>
-      </w:r>
-      <w:r>
-        <w:t xml:space="preserve">commenced</w:t>
-      </w:r>
-      <w:r>
-        <w:t xml:space="preserve"> </w:t>
-      </w:r>
-      <w:r>
-        <w:t xml:space="preserve">in</w:t>
-      </w:r>
-      <w:r>
-        <w:t xml:space="preserve"> </w:t>
-      </w:r>
-      <w:r>
-        <w:t xml:space="preserve">Civil</w:t>
-      </w:r>
-      <w:r>
-        <w:t xml:space="preserve"> </w:t>
-      </w:r>
-      <w:r>
-        <w:t xml:space="preserve">Court,</w:t>
-      </w:r>
-      <w:r>
-        <w:t xml:space="preserve"> </w:t>
-      </w:r>
-      <w:r>
-        <w:t xml:space="preserve">Kings</w:t>
-      </w:r>
-      <w:r>
-        <w:t xml:space="preserve"> </w:t>
-      </w:r>
-      <w:r>
-        <w:t xml:space="preserve">County.</w:t>
-      </w:r>
-    </w:p>
-    <w:p>
-      <w:pPr>
-        <w:spacing w:before="0" w:after="0" w:line="644" w:lineRule="exact"/>
-        <w:ind w:left="0" w:firstLine="720"/>
-        <w:jc w:val="left"/>
-      </w:pPr>
-      <w:r>
-        <w:t xml:space="preserve">4.</w:t>
-      </w:r>
-      <w:r>
-        <w:t xml:space="preserve"> </w:t>
-      </w:r>
-      <w:r>
-        <w:t xml:space="preserve">The</w:t>
-      </w:r>
-      <w:r>
-        <w:t xml:space="preserve"> </w:t>
-      </w:r>
-      <w:r>
-        <w:t xml:space="preserve">action</w:t>
-      </w:r>
-      <w:r>
-        <w:t xml:space="preserve"> </w:t>
-      </w:r>
-      <w:r>
-        <w:t xml:space="preserve">was</w:t>
-      </w:r>
-      <w:r>
-        <w:t xml:space="preserve"> </w:t>
-      </w:r>
-      <w:r>
-        <w:t xml:space="preserve">commenced</w:t>
-      </w:r>
-      <w:r>
-        <w:t xml:space="preserve"> </w:t>
-      </w:r>
-      <w:r>
-        <w:t xml:space="preserve">on</w:t>
-      </w:r>
-      <w:r>
-        <w:t xml:space="preserve"> </w:t>
-      </w:r>
-      <w:r>
-        <w:t xml:space="preserve">or</w:t>
-      </w:r>
-      <w:r>
-        <w:t xml:space="preserve"> </w:t>
-      </w:r>
-      <w:r>
-        <w:t xml:space="preserve">about</w:t>
-      </w:r>
-      <w:r>
-        <w:t xml:space="preserve"> </w:t>
-      </w:r>
-      <w:r>
-        <w:t xml:space="preserve">August</w:t>
-      </w:r>
-      <w:r>
-        <w:t xml:space="preserve"> </w:t>
-      </w:r>
-      <w:r>
-        <w:t xml:space="preserve">26,</w:t>
-      </w:r>
-      <w:r>
-        <w:t xml:space="preserve"> </w:t>
-      </w:r>
-      <w:r>
-        <w:t xml:space="preserve">2005.</w:t>
-      </w:r>
-    </w:p>
-    <w:p>
-      <w:pPr>
-        <w:spacing w:before="0" w:after="0" w:line="644" w:lineRule="exact"/>
-        <w:ind w:left="0" w:firstLine="720"/>
-        <w:jc w:val="left"/>
-      </w:pPr>
-      <w:r>
-        <w:t xml:space="preserve">5.</w:t>
-      </w:r>
-      <w:r>
-        <w:t xml:space="preserve"> </w:t>
-      </w:r>
-      <w:r>
-        <w:t xml:space="preserve">The</w:t>
-      </w:r>
-      <w:r>
-        <w:t xml:space="preserve"> </w:t>
-      </w:r>
-      <w:r>
-        <w:t xml:space="preserve">nature</w:t>
-      </w:r>
-      <w:r>
-        <w:t xml:space="preserve"> </w:t>
-      </w:r>
-      <w:r>
-        <w:t xml:space="preserve">and</w:t>
-      </w:r>
-      <w:r>
-        <w:t xml:space="preserve"> </w:t>
-      </w:r>
-      <w:r>
-        <w:t xml:space="preserve">object</w:t>
-      </w:r>
-      <w:r>
-        <w:t xml:space="preserve"> </w:t>
-      </w:r>
-      <w:r>
-        <w:t xml:space="preserve">of</w:t>
-      </w:r>
-      <w:r>
-        <w:t xml:space="preserve"> </w:t>
-      </w:r>
-      <w:r>
-        <w:t xml:space="preserve">the</w:t>
-      </w:r>
-      <w:r>
-        <w:t xml:space="preserve"> </w:t>
-      </w:r>
-      <w:r>
-        <w:t xml:space="preserve">action</w:t>
-      </w:r>
-      <w:r>
-        <w:t xml:space="preserve"> </w:t>
-      </w:r>
-      <w:r>
-        <w:t xml:space="preserve">is</w:t>
-      </w:r>
-      <w:r>
-        <w:t xml:space="preserve"> </w:t>
-      </w:r>
-      <w:r>
-        <w:t xml:space="preserve">a</w:t>
-      </w:r>
-      <w:r>
-        <w:t xml:space="preserve"> </w:t>
-      </w:r>
-      <w:r>
-        <w:t xml:space="preserve">consumer</w:t>
-      </w:r>
-      <w:r>
-        <w:t xml:space="preserve"> </w:t>
-      </w:r>
-      <w:r>
-        <w:t xml:space="preserve">credit</w:t>
-      </w:r>
-      <w:r>
-        <w:t xml:space="preserve"> </w:t>
-      </w:r>
-      <w:r>
-        <w:t xml:space="preserve">action.</w:t>
-      </w:r>
-    </w:p>
-    <w:p>
-      <w:pPr>
-        <w:spacing w:before="0" w:after="0" w:line="644" w:lineRule="exact"/>
-        <w:ind w:left="0" w:firstLine="720"/>
-        <w:jc w:val="left"/>
-      </w:pPr>
-      <w:r>
-        <w:t xml:space="preserve">6.</w:t>
-      </w:r>
-      <w:r>
-        <w:t xml:space="preserve"> </w:t>
-      </w:r>
-      <w:r>
-        <w:t xml:space="preserve">This</w:t>
-      </w:r>
-      <w:r>
-        <w:t xml:space="preserve"> </w:t>
-      </w:r>
-      <w:r>
-        <w:t xml:space="preserve">appeal</w:t>
-      </w:r>
-      <w:r>
-        <w:t xml:space="preserve"> </w:t>
-      </w:r>
-      <w:r>
-        <w:t xml:space="preserve">is</w:t>
-      </w:r>
-      <w:r>
-        <w:t xml:space="preserve"> </w:t>
-      </w:r>
-      <w:r>
-        <w:t xml:space="preserve">from</w:t>
-      </w:r>
-      <w:r>
-        <w:t xml:space="preserve"> </w:t>
-      </w:r>
-      <w:r>
-        <w:t xml:space="preserve">a</w:t>
-      </w:r>
-      <w:r>
-        <w:t xml:space="preserve"> </w:t>
-      </w:r>
-      <w:r>
-        <w:t xml:space="preserve">decision</w:t>
-      </w:r>
-      <w:r>
-        <w:t xml:space="preserve"> </w:t>
-      </w:r>
-      <w:r>
-        <w:t xml:space="preserve">of</w:t>
-      </w:r>
-      <w:r>
-        <w:t xml:space="preserve"> </w:t>
-      </w:r>
-      <w:r>
-        <w:t xml:space="preserve">the</w:t>
-      </w:r>
-      <w:r>
-        <w:t xml:space="preserve"> </w:t>
-      </w:r>
-      <w:r>
-        <w:t xml:space="preserve">Hon.</w:t>
-      </w:r>
-      <w:r>
-        <w:t xml:space="preserve"> </w:t>
-      </w:r>
-      <w:r>
-        <w:t xml:space="preserve">Carolyn</w:t>
-      </w:r>
-      <w:r>
-        <w:t xml:space="preserve"> </w:t>
-      </w:r>
-      <w:r>
-        <w:t xml:space="preserve">E.</w:t>
-      </w:r>
-      <w:r>
-        <w:t xml:space="preserve"> </w:t>
-      </w:r>
-      <w:r>
-        <w:t xml:space="preserve">Wade,</w:t>
-      </w:r>
-      <w:r>
-        <w:t xml:space="preserve"> </w:t>
-      </w:r>
-      <w:r>
-        <w:t xml:space="preserve">Civil</w:t>
-      </w:r>
-      <w:r>
-        <w:t xml:space="preserve"> </w:t>
-      </w:r>
-      <w:r>
-        <w:t xml:space="preserve">Court</w:t>
-      </w:r>
-      <w:r>
-        <w:t xml:space="preserve"> </w:t>
-      </w:r>
-      <w:r>
-        <w:t xml:space="preserve">Judge,</w:t>
-      </w:r>
-      <w:r>
-        <w:t xml:space="preserve"> </w:t>
-      </w:r>
-      <w:r>
-        <w:t xml:space="preserve">County</w:t>
-      </w:r>
-      <w:r>
-        <w:t xml:space="preserve"> </w:t>
-      </w:r>
-      <w:r>
-        <w:t xml:space="preserve">of</w:t>
-      </w:r>
-      <w:r>
-        <w:t xml:space="preserve"> </w:t>
-      </w:r>
-      <w:r>
-        <w:t xml:space="preserve">Kings,</w:t>
-      </w:r>
-      <w:r>
-        <w:t xml:space="preserve"> </w:t>
-      </w:r>
-      <w:r>
-        <w:t xml:space="preserve">entered</w:t>
-      </w:r>
-      <w:r>
-        <w:t xml:space="preserve"> </w:t>
-      </w:r>
-      <w:r>
-        <w:t xml:space="preserve">and</w:t>
-      </w:r>
-      <w:r>
-        <w:t xml:space="preserve"> </w:t>
-      </w:r>
-      <w:r>
-        <w:t xml:space="preserve">filed</w:t>
-      </w:r>
-      <w:r>
-        <w:t xml:space="preserve"> </w:t>
-      </w:r>
-      <w:r>
-        <w:t xml:space="preserve">on</w:t>
-      </w:r>
-      <w:r>
-        <w:t xml:space="preserve"> </w:t>
-      </w:r>
-      <w:r>
-        <w:t xml:space="preserve">July</w:t>
-      </w:r>
-      <w:r>
-        <w:t xml:space="preserve"> </w:t>
-      </w:r>
-      <w:r>
-        <w:t xml:space="preserve">24,</w:t>
-      </w:r>
-      <w:r>
-        <w:t xml:space="preserve"> </w:t>
-      </w:r>
-      <w:r>
-        <w:t xml:space="preserve">2012,</w:t>
-      </w:r>
-      <w:r>
-        <w:t xml:space="preserve"> </w:t>
-      </w:r>
-      <w:r>
-        <w:t xml:space="preserve">whereby</w:t>
-      </w:r>
-      <w:r>
-        <w:t xml:space="preserve"> </w:t>
-      </w:r>
-      <w:r>
-        <w:t xml:space="preserve">it</w:t>
-      </w:r>
-      <w:r>
-        <w:t xml:space="preserve"> </w:t>
-      </w:r>
-      <w:r>
-        <w:t xml:space="preserve">was</w:t>
-      </w:r>
-      <w:r>
-        <w:t xml:space="preserve"> </w:t>
-      </w:r>
-      <w:r>
-        <w:t xml:space="preserve">adjudged</w:t>
-      </w:r>
-      <w:r>
-        <w:t xml:space="preserve"> </w:t>
-      </w:r>
-      <w:r>
-        <w:t xml:space="preserve">that</w:t>
-      </w:r>
-      <w:r>
-        <w:t xml:space="preserve"> </w:t>
-      </w:r>
-      <w:r>
-        <w:t xml:space="preserve">Defendant-Appellant’s</w:t>
-      </w:r>
-      <w:r>
-        <w:t xml:space="preserve"> </w:t>
-      </w:r>
-      <w:r>
-        <w:t xml:space="preserve">Order</w:t>
-      </w:r>
-      <w:r>
-        <w:t xml:space="preserve"> </w:t>
-      </w:r>
-      <w:r>
-        <w:t xml:space="preserve">to</w:t>
-      </w:r>
-      <w:r>
-        <w:t xml:space="preserve"> </w:t>
-      </w:r>
-      <w:r>
-        <w:t xml:space="preserve">Show</w:t>
-      </w:r>
-      <w:r>
-        <w:t xml:space="preserve"> </w:t>
-      </w:r>
-      <w:r>
-        <w:t xml:space="preserve">Cause</w:t>
-      </w:r>
-      <w:r>
-        <w:t xml:space="preserve"> </w:t>
-      </w:r>
-      <w:r>
-        <w:t xml:space="preserve">to</w:t>
-      </w:r>
-      <w:r>
-        <w:t xml:space="preserve"> </w:t>
-      </w:r>
-      <w:r>
-        <w:t xml:space="preserve">Reargue</w:t>
-      </w:r>
-      <w:r>
-        <w:t xml:space="preserve"> </w:t>
-      </w:r>
-      <w:r>
-        <w:t xml:space="preserve">be</w:t>
-      </w:r>
-      <w:r>
-        <w:t xml:space="preserve"> </w:t>
-      </w:r>
-      <w:r>
-        <w:t xml:space="preserve">granted,</w:t>
-      </w:r>
-      <w:r>
-        <w:t xml:space="preserve"> </w:t>
-      </w:r>
-      <w:r>
-        <w:t xml:space="preserve">and</w:t>
-      </w:r>
-      <w:r>
-        <w:t xml:space="preserve"> </w:t>
-      </w:r>
-      <w:r>
-        <w:t xml:space="preserve">upon</w:t>
-      </w:r>
-      <w:r>
-        <w:t xml:space="preserve"> </w:t>
-      </w:r>
-      <w:r>
-        <w:t xml:space="preserve">reargument,</w:t>
-      </w:r>
-      <w:r>
-        <w:t xml:space="preserve"> </w:t>
-      </w:r>
-      <w:r>
-        <w:t xml:space="preserve">denied.</w:t>
-      </w:r>
-    </w:p>
-    <w:p>
-      <w:pPr>
-        <w:spacing w:before="0" w:after="0" w:line="644" w:lineRule="exact"/>
-        <w:ind w:left="0" w:firstLine="720"/>
-        <w:jc w:val="left"/>
-      </w:pPr>
-      <w:r>
-        <w:t xml:space="preserve">7.</w:t>
-      </w:r>
-      <w:r>
-        <w:t xml:space="preserve"> </w:t>
-      </w:r>
-      <w:r>
-        <w:t xml:space="preserve">The</w:t>
-      </w:r>
-      <w:r>
-        <w:t xml:space="preserve"> </w:t>
-      </w:r>
-      <w:r>
-        <w:t xml:space="preserve">appeal</w:t>
-      </w:r>
-      <w:r>
-        <w:t xml:space="preserve"> </w:t>
-      </w:r>
-      <w:r>
-        <w:t xml:space="preserve">is</w:t>
-      </w:r>
-      <w:r>
-        <w:t xml:space="preserve"> </w:t>
-      </w:r>
-      <w:r>
-        <w:t xml:space="preserve">on</w:t>
-      </w:r>
-      <w:r>
-        <w:t xml:space="preserve"> </w:t>
-      </w:r>
-      <w:r>
-        <w:t xml:space="preserve">the</w:t>
-      </w:r>
-      <w:r>
-        <w:t xml:space="preserve"> </w:t>
-      </w:r>
-      <w:r>
-        <w:t xml:space="preserve">appendix</w:t>
-      </w:r>
-      <w:r>
-        <w:t xml:space="preserve"> </w:t>
-      </w:r>
-      <w:r>
-        <w:t xml:space="preserve">method.</w:t>
-      </w:r>
-    </w:p>
+    <w:tbl>
+      <w:tblPr>
+        <w:tblW w:w="9360" w:type="dxa"/>
+        <w:tblLayout w:type="fixed"/>
+        <w:tblCellMar>
+          <w:top w:w="0" w:type="dxa"/>
+          <w:left w:w="0" w:type="dxa"/>
+          <w:bottom w:w="0" w:type="dxa"/>
+          <w:right w:w="0" w:type="dxa"/>
+        </w:tblCellMar>
+        <w:tblLook w:val="0000" w:firstRow="0" w:lastRow="0" w:firstColumn="0" w:lastColumn="0" w:noHBand="0" w:noVBand="0"/>
+      </w:tblPr>
+      <w:tblGrid>
+        <w:gridCol w:w="576"/>
+        <w:gridCol w:w="8784"/>
+      </w:tblGrid>
+      <w:tr>
+        <w:trPr>
+          <w:cantSplit/>
+        </w:trPr>
+        <w:tc>
+          <w:tcPr>
+            <w:tcW w:w="576" w:type="dxa"/>
+          </w:tcPr>
+          <w:p>
+            <w:pPr>
+              <w:spacing w:before="0" w:after="0" w:line="644" w:lineRule="exact"/>
+              <w:ind w:left="0" w:firstLine="0"/>
+              <w:jc w:val="left"/>
+            </w:pPr>
+            <w:r>
+              <w:t xml:space="preserve">1.</w:t>
+            </w:r>
+          </w:p>
+        </w:tc>
+        <w:tc>
+          <w:tcPr>
+            <w:tcW w:w="8784" w:type="dxa"/>
+          </w:tcPr>
+          <w:p>
+            <w:pPr>
+              <w:spacing w:before="0" w:after="0" w:line="644" w:lineRule="exact"/>
+              <w:ind w:left="0" w:firstLine="0"/>
+              <w:jc w:val="left"/>
+            </w:pPr>
+            <w:r>
+              <w:t xml:space="preserve">The</w:t>
+            </w:r>
+            <w:r>
+              <w:t xml:space="preserve"> </w:t>
+            </w:r>
+            <w:r>
+              <w:t xml:space="preserve">index</w:t>
+            </w:r>
+            <w:r>
+              <w:t xml:space="preserve"> </w:t>
+            </w:r>
+            <w:r>
+              <w:t xml:space="preserve">number</w:t>
+            </w:r>
+            <w:r>
+              <w:t xml:space="preserve"> </w:t>
+            </w:r>
+            <w:r>
+              <w:t xml:space="preserve">of</w:t>
+            </w:r>
+            <w:r>
+              <w:t xml:space="preserve"> </w:t>
+            </w:r>
+            <w:r>
+              <w:t xml:space="preserve">the</w:t>
+            </w:r>
+            <w:r>
+              <w:t xml:space="preserve"> </w:t>
+            </w:r>
+            <w:r>
+              <w:t xml:space="preserve">case</w:t>
+            </w:r>
+            <w:r>
+              <w:t xml:space="preserve"> </w:t>
+            </w:r>
+            <w:r>
+              <w:t xml:space="preserve">is</w:t>
+            </w:r>
+            <w:r>
+              <w:t xml:space="preserve"> </w:t>
+            </w:r>
+            <w:r>
+              <w:t xml:space="preserve">083391</w:t>
+              <w:noBreakHyphen/>
+              <w:t xml:space="preserve">05.</w:t>
+            </w:r>
+          </w:p>
+        </w:tc>
+      </w:tr>
+    </w:tbl>
+    <w:tbl>
+      <w:tblPr>
+        <w:tblW w:w="9360" w:type="dxa"/>
+        <w:tblLayout w:type="fixed"/>
+        <w:tblCellMar>
+          <w:top w:w="0" w:type="dxa"/>
+          <w:left w:w="0" w:type="dxa"/>
+          <w:bottom w:w="0" w:type="dxa"/>
+          <w:right w:w="0" w:type="dxa"/>
+        </w:tblCellMar>
+        <w:tblLook w:val="0000" w:firstRow="0" w:lastRow="0" w:firstColumn="0" w:lastColumn="0" w:noHBand="0" w:noVBand="0"/>
+      </w:tblPr>
+      <w:tblGrid>
+        <w:gridCol w:w="576"/>
+        <w:gridCol w:w="8784"/>
+      </w:tblGrid>
+      <w:tr>
+        <w:trPr>
+          <w:cantSplit/>
+        </w:trPr>
+        <w:tc>
+          <w:tcPr>
+            <w:tcW w:w="576" w:type="dxa"/>
+          </w:tcPr>
+          <w:p>
+            <w:pPr>
+              <w:spacing w:before="0" w:after="0" w:line="644" w:lineRule="exact"/>
+              <w:ind w:left="0" w:firstLine="0"/>
+              <w:jc w:val="left"/>
+            </w:pPr>
+            <w:r>
+              <w:t xml:space="preserve">2.</w:t>
+            </w:r>
+          </w:p>
+        </w:tc>
+        <w:tc>
+          <w:tcPr>
+            <w:tcW w:w="8784" w:type="dxa"/>
+          </w:tcPr>
+          <w:p>
+            <w:pPr>
+              <w:spacing w:before="0" w:after="0" w:line="644" w:lineRule="exact"/>
+              <w:ind w:left="0" w:firstLine="0"/>
+              <w:jc w:val="left"/>
+            </w:pPr>
+            <w:r>
+              <w:t xml:space="preserve">The</w:t>
+            </w:r>
+            <w:r>
+              <w:t xml:space="preserve"> </w:t>
+            </w:r>
+            <w:r>
+              <w:t xml:space="preserve">full</w:t>
+            </w:r>
+            <w:r>
+              <w:t xml:space="preserve"> </w:t>
+            </w:r>
+            <w:r>
+              <w:t xml:space="preserve">names</w:t>
+            </w:r>
+            <w:r>
+              <w:t xml:space="preserve"> </w:t>
+            </w:r>
+            <w:r>
+              <w:t xml:space="preserve">of</w:t>
+            </w:r>
+            <w:r>
+              <w:t xml:space="preserve"> </w:t>
+            </w:r>
+            <w:r>
+              <w:t xml:space="preserve">the</w:t>
+            </w:r>
+            <w:r>
+              <w:t xml:space="preserve"> </w:t>
+            </w:r>
+            <w:r>
+              <w:t xml:space="preserve">original</w:t>
+            </w:r>
+            <w:r>
+              <w:t xml:space="preserve"> </w:t>
+            </w:r>
+            <w:r>
+              <w:t xml:space="preserve">parties</w:t>
+            </w:r>
+            <w:r>
+              <w:t xml:space="preserve"> </w:t>
+            </w:r>
+            <w:r>
+              <w:t xml:space="preserve">are</w:t>
+            </w:r>
+            <w:r>
+              <w:t xml:space="preserve"> </w:t>
+            </w:r>
+            <w:r>
+              <w:t xml:space="preserve">as</w:t>
+            </w:r>
+            <w:r>
+              <w:t xml:space="preserve"> </w:t>
+            </w:r>
+            <w:r>
+              <w:t xml:space="preserve">stated</w:t>
+            </w:r>
+            <w:r>
+              <w:t xml:space="preserve"> </w:t>
+            </w:r>
+            <w:r>
+              <w:t xml:space="preserve">above;</w:t>
+            </w:r>
+            <w:r>
+              <w:t xml:space="preserve"> </w:t>
+            </w:r>
+            <w:r>
+              <w:t xml:space="preserve">there</w:t>
+            </w:r>
+            <w:r>
+              <w:t xml:space="preserve"> </w:t>
+            </w:r>
+            <w:r>
+              <w:t xml:space="preserve">have</w:t>
+            </w:r>
+            <w:r>
+              <w:t xml:space="preserve"> </w:t>
+            </w:r>
+            <w:r>
+              <w:t xml:space="preserve">been</w:t>
+            </w:r>
+            <w:r>
+              <w:t xml:space="preserve"> </w:t>
+            </w:r>
+            <w:r>
+              <w:t xml:space="preserve">no</w:t>
+            </w:r>
+            <w:r>
+              <w:t xml:space="preserve"> </w:t>
+            </w:r>
+            <w:r>
+              <w:t xml:space="preserve">changes.</w:t>
+            </w:r>
+          </w:p>
+        </w:tc>
+      </w:tr>
+    </w:tbl>
+    <w:tbl>
+      <w:tblPr>
+        <w:tblW w:w="9360" w:type="dxa"/>
+        <w:tblLayout w:type="fixed"/>
+        <w:tblCellMar>
+          <w:top w:w="0" w:type="dxa"/>
+          <w:left w:w="0" w:type="dxa"/>
+          <w:bottom w:w="0" w:type="dxa"/>
+          <w:right w:w="0" w:type="dxa"/>
+        </w:tblCellMar>
+        <w:tblLook w:val="0000" w:firstRow="0" w:lastRow="0" w:firstColumn="0" w:lastColumn="0" w:noHBand="0" w:noVBand="0"/>
+      </w:tblPr>
+      <w:tblGrid>
+        <w:gridCol w:w="576"/>
+        <w:gridCol w:w="8784"/>
+      </w:tblGrid>
+      <w:tr>
+        <w:trPr>
+          <w:cantSplit/>
+        </w:trPr>
+        <w:tc>
+          <w:tcPr>
+            <w:tcW w:w="576" w:type="dxa"/>
+          </w:tcPr>
+          <w:p>
+            <w:pPr>
+              <w:spacing w:before="0" w:after="0" w:line="644" w:lineRule="exact"/>
+              <w:ind w:left="0" w:firstLine="0"/>
+              <w:jc w:val="left"/>
+            </w:pPr>
+            <w:r>
+              <w:t xml:space="preserve">3.</w:t>
+            </w:r>
+          </w:p>
+        </w:tc>
+        <w:tc>
+          <w:tcPr>
+            <w:tcW w:w="8784" w:type="dxa"/>
+          </w:tcPr>
+          <w:p>
+            <w:pPr>
+              <w:spacing w:before="0" w:after="0" w:line="644" w:lineRule="exact"/>
+              <w:ind w:left="0" w:firstLine="0"/>
+              <w:jc w:val="left"/>
+            </w:pPr>
+            <w:r>
+              <w:t xml:space="preserve">The</w:t>
+            </w:r>
+            <w:r>
+              <w:t xml:space="preserve"> </w:t>
+            </w:r>
+            <w:r>
+              <w:t xml:space="preserve">action</w:t>
+            </w:r>
+            <w:r>
+              <w:t xml:space="preserve"> </w:t>
+            </w:r>
+            <w:r>
+              <w:t xml:space="preserve">was</w:t>
+            </w:r>
+            <w:r>
+              <w:t xml:space="preserve"> </w:t>
+            </w:r>
+            <w:r>
+              <w:t xml:space="preserve">commenced</w:t>
+            </w:r>
+            <w:r>
+              <w:t xml:space="preserve"> </w:t>
+            </w:r>
+            <w:r>
+              <w:t xml:space="preserve">in</w:t>
+            </w:r>
+            <w:r>
+              <w:t xml:space="preserve"> </w:t>
+            </w:r>
+            <w:r>
+              <w:t xml:space="preserve">Civil</w:t>
+            </w:r>
+            <w:r>
+              <w:t xml:space="preserve"> </w:t>
+            </w:r>
+            <w:r>
+              <w:t xml:space="preserve">Court,</w:t>
+            </w:r>
+            <w:r>
+              <w:t xml:space="preserve"> </w:t>
+            </w:r>
+            <w:r>
+              <w:t xml:space="preserve">Kings</w:t>
+            </w:r>
+            <w:r>
+              <w:t xml:space="preserve"> </w:t>
+            </w:r>
+            <w:r>
+              <w:t xml:space="preserve">County.</w:t>
+            </w:r>
+          </w:p>
+        </w:tc>
+      </w:tr>
+    </w:tbl>
+    <w:tbl>
+      <w:tblPr>
+        <w:tblW w:w="9360" w:type="dxa"/>
+        <w:tblLayout w:type="fixed"/>
+        <w:tblCellMar>
+          <w:top w:w="0" w:type="dxa"/>
+          <w:left w:w="0" w:type="dxa"/>
+          <w:bottom w:w="0" w:type="dxa"/>
+          <w:right w:w="0" w:type="dxa"/>
+        </w:tblCellMar>
+        <w:tblLook w:val="0000" w:firstRow="0" w:lastRow="0" w:firstColumn="0" w:lastColumn="0" w:noHBand="0" w:noVBand="0"/>
+      </w:tblPr>
+      <w:tblGrid>
+        <w:gridCol w:w="576"/>
+        <w:gridCol w:w="8784"/>
+      </w:tblGrid>
+      <w:tr>
+        <w:trPr>
+          <w:cantSplit/>
+        </w:trPr>
+        <w:tc>
+          <w:tcPr>
+            <w:tcW w:w="576" w:type="dxa"/>
+          </w:tcPr>
+          <w:p>
+            <w:pPr>
+              <w:spacing w:before="0" w:after="0" w:line="644" w:lineRule="exact"/>
+              <w:ind w:left="0" w:firstLine="0"/>
+              <w:jc w:val="left"/>
+            </w:pPr>
+            <w:r>
+              <w:t xml:space="preserve">4.</w:t>
+            </w:r>
+          </w:p>
+        </w:tc>
+        <w:tc>
+          <w:tcPr>
+            <w:tcW w:w="8784" w:type="dxa"/>
+          </w:tcPr>
+          <w:p>
+            <w:pPr>
+              <w:spacing w:before="0" w:after="0" w:line="644" w:lineRule="exact"/>
+              <w:ind w:left="0" w:firstLine="0"/>
+              <w:jc w:val="left"/>
+            </w:pPr>
+            <w:r>
+              <w:t xml:space="preserve">The</w:t>
+            </w:r>
+            <w:r>
+              <w:t xml:space="preserve"> </w:t>
+            </w:r>
+            <w:r>
+              <w:t xml:space="preserve">action</w:t>
+            </w:r>
+            <w:r>
+              <w:t xml:space="preserve"> </w:t>
+            </w:r>
+            <w:r>
+              <w:t xml:space="preserve">was</w:t>
+            </w:r>
+            <w:r>
+              <w:t xml:space="preserve"> </w:t>
+            </w:r>
+            <w:r>
+              <w:t xml:space="preserve">commenced</w:t>
+            </w:r>
+            <w:r>
+              <w:t xml:space="preserve"> </w:t>
+            </w:r>
+            <w:r>
+              <w:t xml:space="preserve">on</w:t>
+            </w:r>
+            <w:r>
+              <w:t xml:space="preserve"> </w:t>
+            </w:r>
+            <w:r>
+              <w:t xml:space="preserve">or</w:t>
+            </w:r>
+            <w:r>
+              <w:t xml:space="preserve"> </w:t>
+            </w:r>
+            <w:r>
+              <w:t xml:space="preserve">about</w:t>
+            </w:r>
+            <w:r>
+              <w:t xml:space="preserve"> </w:t>
+            </w:r>
+            <w:r>
+              <w:t xml:space="preserve">August</w:t>
+            </w:r>
+            <w:r>
+              <w:t xml:space="preserve"> </w:t>
+            </w:r>
+            <w:r>
+              <w:t xml:space="preserve">26,</w:t>
+            </w:r>
+            <w:r>
+              <w:t xml:space="preserve"> </w:t>
+            </w:r>
+            <w:r>
+              <w:t xml:space="preserve">2005.</w:t>
+            </w:r>
+          </w:p>
+        </w:tc>
+      </w:tr>
+    </w:tbl>
+    <w:tbl>
+      <w:tblPr>
+        <w:tblW w:w="9360" w:type="dxa"/>
+        <w:tblLayout w:type="fixed"/>
+        <w:tblCellMar>
+          <w:top w:w="0" w:type="dxa"/>
+          <w:left w:w="0" w:type="dxa"/>
+          <w:bottom w:w="0" w:type="dxa"/>
+          <w:right w:w="0" w:type="dxa"/>
+        </w:tblCellMar>
+        <w:tblLook w:val="0000" w:firstRow="0" w:lastRow="0" w:firstColumn="0" w:lastColumn="0" w:noHBand="0" w:noVBand="0"/>
+      </w:tblPr>
+      <w:tblGrid>
+        <w:gridCol w:w="576"/>
+        <w:gridCol w:w="8784"/>
+      </w:tblGrid>
+      <w:tr>
+        <w:trPr>
+          <w:cantSplit/>
+        </w:trPr>
+        <w:tc>
+          <w:tcPr>
+            <w:tcW w:w="576" w:type="dxa"/>
+          </w:tcPr>
+          <w:p>
+            <w:pPr>
+              <w:spacing w:before="0" w:after="0" w:line="644" w:lineRule="exact"/>
+              <w:ind w:left="0" w:firstLine="0"/>
+              <w:jc w:val="left"/>
+            </w:pPr>
+            <w:r>
+              <w:t xml:space="preserve">5.</w:t>
+            </w:r>
+          </w:p>
+        </w:tc>
+        <w:tc>
+          <w:tcPr>
+            <w:tcW w:w="8784" w:type="dxa"/>
+          </w:tcPr>
+          <w:p>
+            <w:pPr>
+              <w:spacing w:before="0" w:after="0" w:line="644" w:lineRule="exact"/>
+              <w:ind w:left="0" w:firstLine="0"/>
+              <w:jc w:val="left"/>
+            </w:pPr>
+            <w:r>
+              <w:t xml:space="preserve">The</w:t>
+            </w:r>
+            <w:r>
+              <w:t xml:space="preserve"> </w:t>
+            </w:r>
+            <w:r>
+              <w:t xml:space="preserve">nature</w:t>
+            </w:r>
+            <w:r>
+              <w:t xml:space="preserve"> </w:t>
+            </w:r>
+            <w:r>
+              <w:t xml:space="preserve">and</w:t>
+            </w:r>
+            <w:r>
+              <w:t xml:space="preserve"> </w:t>
+            </w:r>
+            <w:r>
+              <w:t xml:space="preserve">object</w:t>
+            </w:r>
+            <w:r>
+              <w:t xml:space="preserve"> </w:t>
+            </w:r>
+            <w:r>
+              <w:t xml:space="preserve">of</w:t>
+            </w:r>
+            <w:r>
+              <w:t xml:space="preserve"> </w:t>
+            </w:r>
+            <w:r>
+              <w:t xml:space="preserve">the</w:t>
+            </w:r>
+            <w:r>
+              <w:t xml:space="preserve"> </w:t>
+            </w:r>
+            <w:r>
+              <w:t xml:space="preserve">action</w:t>
+            </w:r>
+            <w:r>
+              <w:t xml:space="preserve"> </w:t>
+            </w:r>
+            <w:r>
+              <w:t xml:space="preserve">is</w:t>
+            </w:r>
+            <w:r>
+              <w:t xml:space="preserve"> </w:t>
+            </w:r>
+            <w:r>
+              <w:t xml:space="preserve">a</w:t>
+            </w:r>
+            <w:r>
+              <w:t xml:space="preserve"> </w:t>
+            </w:r>
+            <w:r>
+              <w:t xml:space="preserve">consumer</w:t>
+            </w:r>
+            <w:r>
+              <w:t xml:space="preserve"> </w:t>
+            </w:r>
+            <w:r>
+              <w:t xml:space="preserve">credit</w:t>
+            </w:r>
+            <w:r>
+              <w:t xml:space="preserve"> </w:t>
+            </w:r>
+            <w:r>
+              <w:t xml:space="preserve">action.</w:t>
+            </w:r>
+          </w:p>
+        </w:tc>
+      </w:tr>
+    </w:tbl>
+    <w:tbl>
+      <w:tblPr>
+        <w:tblW w:w="9360" w:type="dxa"/>
+        <w:tblLayout w:type="fixed"/>
+        <w:tblCellMar>
+          <w:top w:w="0" w:type="dxa"/>
+          <w:left w:w="0" w:type="dxa"/>
+          <w:bottom w:w="0" w:type="dxa"/>
+          <w:right w:w="0" w:type="dxa"/>
+        </w:tblCellMar>
+        <w:tblLook w:val="0000" w:firstRow="0" w:lastRow="0" w:firstColumn="0" w:lastColumn="0" w:noHBand="0" w:noVBand="0"/>
+      </w:tblPr>
+      <w:tblGrid>
+        <w:gridCol w:w="576"/>
+        <w:gridCol w:w="8784"/>
+      </w:tblGrid>
+      <w:tr>
+        <w:trPr>
+          <w:cantSplit/>
+        </w:trPr>
+        <w:tc>
+          <w:tcPr>
+            <w:tcW w:w="576" w:type="dxa"/>
+          </w:tcPr>
+          <w:p>
+            <w:pPr>
+              <w:spacing w:before="0" w:after="0" w:line="644" w:lineRule="exact"/>
+              <w:ind w:left="0" w:firstLine="0"/>
+              <w:jc w:val="left"/>
+            </w:pPr>
+            <w:r>
+              <w:t xml:space="preserve">6.</w:t>
+            </w:r>
+          </w:p>
+        </w:tc>
+        <w:tc>
+          <w:tcPr>
+            <w:tcW w:w="8784" w:type="dxa"/>
+          </w:tcPr>
+          <w:p>
+            <w:pPr>
+              <w:spacing w:before="0" w:after="0" w:line="644" w:lineRule="exact"/>
+              <w:ind w:left="0" w:firstLine="0"/>
+              <w:jc w:val="left"/>
+            </w:pPr>
+            <w:r>
+              <w:t xml:space="preserve">This</w:t>
+            </w:r>
+            <w:r>
+              <w:t xml:space="preserve"> </w:t>
+            </w:r>
+            <w:r>
+              <w:t xml:space="preserve">appeal</w:t>
+            </w:r>
+            <w:r>
+              <w:t xml:space="preserve"> </w:t>
+            </w:r>
+            <w:r>
+              <w:t xml:space="preserve">is</w:t>
+            </w:r>
+            <w:r>
+              <w:t xml:space="preserve"> </w:t>
+            </w:r>
+            <w:r>
+              <w:t xml:space="preserve">from</w:t>
+            </w:r>
+            <w:r>
+              <w:t xml:space="preserve"> </w:t>
+            </w:r>
+            <w:r>
+              <w:t xml:space="preserve">a</w:t>
+            </w:r>
+            <w:r>
+              <w:t xml:space="preserve"> </w:t>
+            </w:r>
+            <w:r>
+              <w:t xml:space="preserve">decision</w:t>
+            </w:r>
+            <w:r>
+              <w:t xml:space="preserve"> </w:t>
+            </w:r>
+            <w:r>
+              <w:t xml:space="preserve">of</w:t>
+            </w:r>
+            <w:r>
+              <w:t xml:space="preserve"> </w:t>
+            </w:r>
+            <w:r>
+              <w:t xml:space="preserve">the</w:t>
+            </w:r>
+            <w:r>
+              <w:t xml:space="preserve"> </w:t>
+            </w:r>
+            <w:r>
+              <w:t xml:space="preserve">Hon.</w:t>
+            </w:r>
+            <w:r>
+              <w:t xml:space="preserve"> </w:t>
+            </w:r>
+            <w:r>
+              <w:t xml:space="preserve">Carolyn</w:t>
+            </w:r>
+            <w:r>
+              <w:t xml:space="preserve"> </w:t>
+            </w:r>
+            <w:r>
+              <w:t xml:space="preserve">E.</w:t>
+            </w:r>
+            <w:r>
+              <w:t xml:space="preserve"> </w:t>
+            </w:r>
+            <w:r>
+              <w:t xml:space="preserve">Wade,</w:t>
+            </w:r>
+            <w:r>
+              <w:t xml:space="preserve"> </w:t>
+            </w:r>
+            <w:r>
+              <w:t xml:space="preserve">Civil</w:t>
+            </w:r>
+            <w:r>
+              <w:t xml:space="preserve"> </w:t>
+            </w:r>
+            <w:r>
+              <w:t xml:space="preserve">Court</w:t>
+            </w:r>
+            <w:r>
+              <w:t xml:space="preserve"> </w:t>
+            </w:r>
+            <w:r>
+              <w:t xml:space="preserve">Judge,</w:t>
+            </w:r>
+            <w:r>
+              <w:t xml:space="preserve"> </w:t>
+            </w:r>
+            <w:r>
+              <w:t xml:space="preserve">County</w:t>
+            </w:r>
+            <w:r>
+              <w:t xml:space="preserve"> </w:t>
+            </w:r>
+            <w:r>
+              <w:t xml:space="preserve">of</w:t>
+            </w:r>
+            <w:r>
+              <w:t xml:space="preserve"> </w:t>
+            </w:r>
+            <w:r>
+              <w:t xml:space="preserve">Kings,</w:t>
+            </w:r>
+            <w:r>
+              <w:t xml:space="preserve"> </w:t>
+            </w:r>
+            <w:r>
+              <w:t xml:space="preserve">entered</w:t>
+            </w:r>
+            <w:r>
+              <w:t xml:space="preserve"> </w:t>
+            </w:r>
+            <w:r>
+              <w:t xml:space="preserve">and</w:t>
+            </w:r>
+            <w:r>
+              <w:t xml:space="preserve"> </w:t>
+            </w:r>
+            <w:r>
+              <w:t xml:space="preserve">filed</w:t>
+            </w:r>
+            <w:r>
+              <w:t xml:space="preserve"> </w:t>
+            </w:r>
+            <w:r>
+              <w:t xml:space="preserve">on</w:t>
+            </w:r>
+            <w:r>
+              <w:t xml:space="preserve"> </w:t>
+            </w:r>
+            <w:r>
+              <w:t xml:space="preserve">July</w:t>
+            </w:r>
+            <w:r>
+              <w:t xml:space="preserve"> </w:t>
+            </w:r>
+            <w:r>
+              <w:t xml:space="preserve">24,</w:t>
+            </w:r>
+            <w:r>
+              <w:t xml:space="preserve"> </w:t>
+            </w:r>
+            <w:r>
+              <w:t xml:space="preserve">2012,</w:t>
+            </w:r>
+            <w:r>
+              <w:t xml:space="preserve"> </w:t>
+            </w:r>
+            <w:r>
+              <w:t xml:space="preserve">whereby</w:t>
+            </w:r>
+            <w:r>
+              <w:t xml:space="preserve"> </w:t>
+            </w:r>
+            <w:r>
+              <w:t xml:space="preserve">it</w:t>
+            </w:r>
+            <w:r>
+              <w:t xml:space="preserve"> </w:t>
+            </w:r>
+            <w:r>
+              <w:t xml:space="preserve">was</w:t>
+            </w:r>
+            <w:r>
+              <w:t xml:space="preserve"> </w:t>
+            </w:r>
+            <w:r>
+              <w:t xml:space="preserve">adjudged</w:t>
+            </w:r>
+            <w:r>
+              <w:t xml:space="preserve"> </w:t>
+            </w:r>
+            <w:r>
+              <w:t xml:space="preserve">that</w:t>
+            </w:r>
+            <w:r>
+              <w:t xml:space="preserve"> </w:t>
+            </w:r>
+            <w:r>
+              <w:t xml:space="preserve">Defendant-Appellant’s</w:t>
+            </w:r>
+            <w:r>
+              <w:t xml:space="preserve"> </w:t>
+            </w:r>
+            <w:r>
+              <w:t xml:space="preserve">Order</w:t>
+            </w:r>
+            <w:r>
+              <w:t xml:space="preserve"> </w:t>
+            </w:r>
+            <w:r>
+              <w:t xml:space="preserve">to</w:t>
+            </w:r>
+            <w:r>
+              <w:t xml:space="preserve"> </w:t>
+            </w:r>
+            <w:r>
+              <w:t xml:space="preserve">Show</w:t>
+            </w:r>
+            <w:r>
+              <w:t xml:space="preserve"> </w:t>
+            </w:r>
+            <w:r>
+              <w:t xml:space="preserve">Cause</w:t>
+            </w:r>
+            <w:r>
+              <w:t xml:space="preserve"> </w:t>
+            </w:r>
+            <w:r>
+              <w:t xml:space="preserve">to</w:t>
+            </w:r>
+            <w:r>
+              <w:t xml:space="preserve"> </w:t>
+            </w:r>
+            <w:r>
+              <w:t xml:space="preserve">Reargue</w:t>
+            </w:r>
+            <w:r>
+              <w:t xml:space="preserve"> </w:t>
+            </w:r>
+            <w:r>
+              <w:t xml:space="preserve">be</w:t>
+            </w:r>
+            <w:r>
+              <w:t xml:space="preserve"> </w:t>
+            </w:r>
+            <w:r>
+              <w:t xml:space="preserve">granted,</w:t>
+            </w:r>
+            <w:r>
+              <w:t xml:space="preserve"> </w:t>
+            </w:r>
+            <w:r>
+              <w:t xml:space="preserve">and</w:t>
+            </w:r>
+            <w:r>
+              <w:t xml:space="preserve"> </w:t>
+            </w:r>
+            <w:r>
+              <w:t xml:space="preserve">upon</w:t>
+            </w:r>
+            <w:r>
+              <w:t xml:space="preserve"> </w:t>
+            </w:r>
+            <w:r>
+              <w:t xml:space="preserve">reargument,</w:t>
+            </w:r>
+            <w:r>
+              <w:t xml:space="preserve"> </w:t>
+            </w:r>
+            <w:r>
+              <w:t xml:space="preserve">denied.</w:t>
+            </w:r>
+          </w:p>
+        </w:tc>
+      </w:tr>
+    </w:tbl>
+    <w:tbl>
+      <w:tblPr>
+        <w:tblW w:w="9360" w:type="dxa"/>
+        <w:tblLayout w:type="fixed"/>
+        <w:tblCellMar>
+          <w:top w:w="0" w:type="dxa"/>
+          <w:left w:w="0" w:type="dxa"/>
+          <w:bottom w:w="0" w:type="dxa"/>
+          <w:right w:w="0" w:type="dxa"/>
+        </w:tblCellMar>
+        <w:tblLook w:val="0000" w:firstRow="0" w:lastRow="0" w:firstColumn="0" w:lastColumn="0" w:noHBand="0" w:noVBand="0"/>
+      </w:tblPr>
+      <w:tblGrid>
+        <w:gridCol w:w="576"/>
+        <w:gridCol w:w="8784"/>
+      </w:tblGrid>
+      <w:tr>
+        <w:trPr>
+          <w:cantSplit/>
+        </w:trPr>
+        <w:tc>
+          <w:tcPr>
+            <w:tcW w:w="576" w:type="dxa"/>
+          </w:tcPr>
+          <w:p>
+            <w:pPr>
+              <w:spacing w:before="0" w:after="0" w:line="644" w:lineRule="exact"/>
+              <w:ind w:left="0" w:firstLine="0"/>
+              <w:jc w:val="left"/>
+            </w:pPr>
+            <w:r>
+              <w:t xml:space="preserve">7.</w:t>
+            </w:r>
+          </w:p>
+        </w:tc>
+        <w:tc>
+          <w:tcPr>
+            <w:tcW w:w="8784" w:type="dxa"/>
+          </w:tcPr>
+          <w:p>
+            <w:pPr>
+              <w:spacing w:before="0" w:after="0" w:line="644" w:lineRule="exact"/>
+              <w:ind w:left="0" w:firstLine="0"/>
+              <w:jc w:val="left"/>
+            </w:pPr>
+            <w:r>
+              <w:t xml:space="preserve">The</w:t>
+            </w:r>
+            <w:r>
+              <w:t xml:space="preserve"> </w:t>
+            </w:r>
+            <w:r>
+              <w:t xml:space="preserve">appeal</w:t>
+            </w:r>
+            <w:r>
+              <w:t xml:space="preserve"> </w:t>
+            </w:r>
+            <w:r>
+              <w:t xml:space="preserve">is</w:t>
+            </w:r>
+            <w:r>
+              <w:t xml:space="preserve"> </w:t>
+            </w:r>
+            <w:r>
+              <w:t xml:space="preserve">on</w:t>
+            </w:r>
+            <w:r>
+              <w:t xml:space="preserve"> </w:t>
+            </w:r>
+            <w:r>
+              <w:t xml:space="preserve">the</w:t>
+            </w:r>
+            <w:r>
+              <w:t xml:space="preserve"> </w:t>
+            </w:r>
+            <w:r>
+              <w:t xml:space="preserve">appendix</w:t>
+            </w:r>
+            <w:r>
+              <w:t xml:space="preserve"> </w:t>
+            </w:r>
+            <w:r>
+              <w:t xml:space="preserve">method.</w:t>
+            </w:r>
+          </w:p>
+        </w:tc>
+      </w:tr>
+    </w:tbl>
     <w:tbl>
       <w:tblPr>
         <w:tblW w:w="9360" w:type="dxa"/>

</xml_diff>